<commit_message>
MODEL + DAO (veiculo e motorista)
Model (três completos) + DAO crud motorista e veiculo + teste via console x banco.
</commit_message>
<xml_diff>
--- a/Escopo do projeto/Escopo do projeto de LGPR.docx
+++ b/Escopo do projeto/Escopo do projeto de LGPR.docx
@@ -33,17 +33,6 @@
     <w:p>
       <w:r>
         <w:t xml:space="preserve">Mudanças: </w:t>
-      </w:r>
-    </w:p>
-    <w:p>
-      <w:r>
-        <w:t xml:space="preserve">Relacionamento entre Motorista e Veículo foi atualizado (antes era n para n, e agora é 1 para </w:t>
-      </w:r>
-      <w:r>
-        <w:t>1</w:t>
-      </w:r>
-      <w:r>
-        <w:t>);</w:t>
       </w:r>
     </w:p>
     <w:p>
@@ -144,10 +133,10 @@
     <w:p>
       <w:r>
         <w:drawing>
-          <wp:inline distT="0" distB="0" distL="0" distR="0" wp14:anchorId="6FE524E0" wp14:editId="66EF5CF6">
-            <wp:extent cx="5400040" cy="3488055"/>
-            <wp:effectExtent l="0" t="0" r="0" b="0"/>
-            <wp:docPr id="630791004" name="Imagem 1"/>
+          <wp:inline distT="0" distB="0" distL="0" distR="0" wp14:anchorId="1694FFBF" wp14:editId="2578F411">
+            <wp:extent cx="5400040" cy="3482975"/>
+            <wp:effectExtent l="0" t="0" r="0" b="3175"/>
+            <wp:docPr id="1581728547" name="Imagem 1"/>
             <wp:cNvGraphicFramePr>
               <a:graphicFrameLocks xmlns:a="http://schemas.openxmlformats.org/drawingml/2006/main" noChangeAspect="1"/>
             </wp:cNvGraphicFramePr>
@@ -155,7 +144,7 @@
               <a:graphicData uri="http://schemas.openxmlformats.org/drawingml/2006/picture">
                 <pic:pic xmlns:pic="http://schemas.openxmlformats.org/drawingml/2006/picture">
                   <pic:nvPicPr>
-                    <pic:cNvPr id="630791004" name=""/>
+                    <pic:cNvPr id="1581728547" name=""/>
                     <pic:cNvPicPr/>
                   </pic:nvPicPr>
                   <pic:blipFill>
@@ -167,7 +156,7 @@
                   <pic:spPr>
                     <a:xfrm>
                       <a:off x="0" y="0"/>
-                      <a:ext cx="5400040" cy="3488055"/>
+                      <a:ext cx="5400040" cy="3482975"/>
                     </a:xfrm>
                     <a:prstGeom prst="rect">
                       <a:avLst/>
@@ -190,6 +179,9 @@
         <w:br/>
       </w:r>
       <w:r>
+        <w:rPr>
+          <w:noProof/>
+        </w:rPr>
         <w:drawing>
           <wp:inline distT="0" distB="0" distL="0" distR="0" wp14:anchorId="29462317" wp14:editId="7E9B53F2">
             <wp:extent cx="5400040" cy="4246245"/>

</xml_diff>